<commit_message>
final commit before submit
</commit_message>
<xml_diff>
--- a/Assignment2/report.docx
+++ b/Assignment2/report.docx
@@ -124,23 +124,15 @@
         <w:jc w:val="center"/>
       </w:pPr>
       <w:r>
-        <w:t xml:space="preserve">are clearly attributed in my submission. I will show I agree to this </w:t>
-      </w:r>
-      <w:proofErr w:type="spellStart"/>
-      <w:r>
-        <w:t>honor</w:t>
-      </w:r>
-      <w:proofErr w:type="spellEnd"/>
-    </w:p>
-    <w:p>
-      <w:pPr>
-        <w:jc w:val="center"/>
-      </w:pPr>
-      <w:r>
-        <w:t>code by typing “Yes”:</w:t>
-      </w:r>
-      <w:r>
-        <w:t xml:space="preserve"> Yes</w:t>
+        <w:t>are clearly attributed in my submission. I will show I agree to this honor</w:t>
+      </w:r>
+    </w:p>
+    <w:p>
+      <w:pPr>
+        <w:jc w:val="center"/>
+      </w:pPr>
+      <w:r>
+        <w:t>code by typing “Yes”: Yes</w:t>
       </w:r>
     </w:p>
     <w:p>
@@ -195,6 +187,15 @@
     </w:p>
     <w:sdt>
       <w:sdtPr>
+        <w:rPr>
+          <w:rFonts w:asciiTheme="minorHAnsi" w:eastAsiaTheme="minorHAnsi" w:hAnsiTheme="minorHAnsi" w:cstheme="minorBidi"/>
+          <w:color w:val="auto"/>
+          <w:kern w:val="2"/>
+          <w:sz w:val="22"/>
+          <w:szCs w:val="22"/>
+          <w:lang w:val="en-AU"/>
+          <w14:ligatures w14:val="standardContextual"/>
+        </w:rPr>
         <w:id w:val="616871219"/>
         <w:docPartObj>
           <w:docPartGallery w:val="Table of Contents"/>
@@ -203,16 +204,9 @@
       </w:sdtPr>
       <w:sdtEndPr>
         <w:rPr>
-          <w:rFonts w:asciiTheme="minorHAnsi" w:eastAsiaTheme="minorHAnsi" w:hAnsiTheme="minorHAnsi" w:cstheme="minorBidi"/>
           <w:b/>
           <w:bCs/>
           <w:noProof/>
-          <w:color w:val="auto"/>
-          <w:kern w:val="2"/>
-          <w:sz w:val="22"/>
-          <w:szCs w:val="22"/>
-          <w:lang w:val="en-AU"/>
-          <w14:ligatures w14:val="standardContextual"/>
         </w:rPr>
       </w:sdtEndPr>
       <w:sdtContent>
@@ -1043,47 +1037,7 @@
     </w:p>
     <w:p>
       <w:r>
-        <w:t xml:space="preserve">The dataset supplied from the UCI machine learning repository contained over 500,000 total transactions from a singular store based in the UK recorded between December 2010 until December 2011. 8 Attributes that stood out were </w:t>
-      </w:r>
-      <w:proofErr w:type="spellStart"/>
-      <w:r>
-        <w:t>InvoiceNO</w:t>
-      </w:r>
-      <w:proofErr w:type="spellEnd"/>
-      <w:r>
-        <w:t xml:space="preserve">, </w:t>
-      </w:r>
-      <w:proofErr w:type="spellStart"/>
-      <w:r>
-        <w:t>StockCode</w:t>
-      </w:r>
-      <w:proofErr w:type="spellEnd"/>
-      <w:r>
-        <w:t xml:space="preserve">, Description, Quantity, </w:t>
-      </w:r>
-      <w:proofErr w:type="spellStart"/>
-      <w:r>
-        <w:t>InvoiceDate</w:t>
-      </w:r>
-      <w:proofErr w:type="spellEnd"/>
-      <w:r>
-        <w:t xml:space="preserve">, </w:t>
-      </w:r>
-      <w:proofErr w:type="spellStart"/>
-      <w:r>
-        <w:t>UnitPrice</w:t>
-      </w:r>
-      <w:proofErr w:type="spellEnd"/>
-      <w:r>
-        <w:t xml:space="preserve">, </w:t>
-      </w:r>
-      <w:proofErr w:type="spellStart"/>
-      <w:r>
-        <w:t>CustomerID</w:t>
-      </w:r>
-      <w:proofErr w:type="spellEnd"/>
-      <w:r>
-        <w:t xml:space="preserve"> and Country. The dataset was originally in </w:t>
+        <w:t xml:space="preserve">The dataset supplied from the UCI machine learning repository contained over 500,000 total transactions from a singular store based in the UK recorded between December 2010 until December 2011. 8 Attributes that stood out were InvoiceNO, StockCode, Description, Quantity, InvoiceDate, UnitPrice, CustomerID and Country. The dataset was originally in </w:t>
       </w:r>
       <w:r>
         <w:t>an</w:t>
@@ -1124,15 +1078,7 @@
         <w:t>pandas,</w:t>
       </w:r>
       <w:r>
-        <w:t xml:space="preserve"> I forced a command to allow for it to be converted. When removing the cancellations, missing </w:t>
-      </w:r>
-      <w:proofErr w:type="spellStart"/>
-      <w:r>
-        <w:t>customerIDs</w:t>
-      </w:r>
-      <w:proofErr w:type="spellEnd"/>
-      <w:r>
-        <w:t xml:space="preserve"> and invalid rows, the main RFM table was built for each customer. Outliers were capped at the 99</w:t>
+        <w:t xml:space="preserve"> I forced a command to allow for it to be converted. When removing the cancellations, missing customerIDs and invalid rows, the main RFM table was built for each customer. Outliers were capped at the 99</w:t>
       </w:r>
       <w:r>
         <w:rPr>
@@ -1164,23 +1110,7 @@
         <w:t>c</w:t>
       </w:r>
       <w:r>
-        <w:t xml:space="preserve">olumns were then explored individually using descriptive statistics and visualisations. Histograms were mostly used for variables such as Quantity and </w:t>
-      </w:r>
-      <w:proofErr w:type="spellStart"/>
-      <w:r>
-        <w:t>UnitPrice</w:t>
-      </w:r>
-      <w:proofErr w:type="spellEnd"/>
-      <w:r>
-        <w:t xml:space="preserve">, Bar charts for categorical variables such as Country and </w:t>
-      </w:r>
-      <w:proofErr w:type="spellStart"/>
-      <w:r>
-        <w:t>StockCode</w:t>
-      </w:r>
-      <w:proofErr w:type="spellEnd"/>
-      <w:r>
-        <w:t xml:space="preserve"> and line charts for a monthly revenue trend. Ten pairs of attributes were also explored using scatter plots and heatmaps to display and outline relationships. </w:t>
+        <w:t xml:space="preserve">olumns were then explored individually using descriptive statistics and visualisations. Histograms were mostly used for variables such as Quantity and UnitPrice, Bar charts for categorical variables such as Country and StockCode and line charts for a monthly revenue trend. Ten pairs of attributes were also explored using scatter plots and heatmaps to display and outline relationships. </w:t>
       </w:r>
     </w:p>
     <w:p>
@@ -1281,24 +1211,14 @@
       <w:r>
         <w:t xml:space="preserve">Figure </w:t>
       </w:r>
-      <w:r>
-        <w:fldChar w:fldCharType="begin"/>
-      </w:r>
-      <w:r>
-        <w:instrText xml:space="preserve"> SEQ Figure \* ARABIC </w:instrText>
-      </w:r>
-      <w:r>
-        <w:fldChar w:fldCharType="separate"/>
-      </w:r>
-      <w:r>
-        <w:rPr>
-          <w:noProof/>
-        </w:rPr>
-        <w:t>1</w:t>
-      </w:r>
-      <w:r>
-        <w:fldChar w:fldCharType="end"/>
-      </w:r>
+      <w:fldSimple w:instr=" SEQ Figure \* ARABIC ">
+        <w:r>
+          <w:rPr>
+            <w:noProof/>
+          </w:rPr>
+          <w:t>1</w:t>
+        </w:r>
+      </w:fldSimple>
       <w:r>
         <w:t>: Monthly Revenue Chart (December 2010 to December 2011)</w:t>
       </w:r>
@@ -1334,7 +1254,7 @@
           <w:noProof/>
         </w:rPr>
         <w:drawing>
-          <wp:inline distT="0" distB="0" distL="0" distR="0" wp14:anchorId="6C9F427E" wp14:editId="12A2F1B0">
+          <wp:inline distT="0" distB="0" distL="0" distR="0" wp14:anchorId="6C9F427E" wp14:editId="038E842F">
             <wp:extent cx="5725160" cy="1637665"/>
             <wp:effectExtent l="0" t="0" r="8890" b="635"/>
             <wp:docPr id="872886944" name="Picture 2"/>
@@ -1390,24 +1310,14 @@
       <w:r>
         <w:t xml:space="preserve">Figure </w:t>
       </w:r>
-      <w:r>
-        <w:fldChar w:fldCharType="begin"/>
-      </w:r>
-      <w:r>
-        <w:instrText xml:space="preserve"> SEQ Figure \* ARABIC </w:instrText>
-      </w:r>
-      <w:r>
-        <w:fldChar w:fldCharType="separate"/>
-      </w:r>
-      <w:r>
-        <w:rPr>
-          <w:noProof/>
-        </w:rPr>
-        <w:t>2</w:t>
-      </w:r>
-      <w:r>
-        <w:fldChar w:fldCharType="end"/>
-      </w:r>
+      <w:fldSimple w:instr=" SEQ Figure \* ARABIC ">
+        <w:r>
+          <w:rPr>
+            <w:noProof/>
+          </w:rPr>
+          <w:t>2</w:t>
+        </w:r>
+      </w:fldSimple>
       <w:r>
         <w:t>: RFM diagram</w:t>
       </w:r>
@@ -1500,24 +1410,14 @@
       <w:r>
         <w:t xml:space="preserve">Figure </w:t>
       </w:r>
-      <w:r>
-        <w:fldChar w:fldCharType="begin"/>
-      </w:r>
-      <w:r>
-        <w:instrText xml:space="preserve"> SEQ Figure \* ARABIC </w:instrText>
-      </w:r>
-      <w:r>
-        <w:fldChar w:fldCharType="separate"/>
-      </w:r>
-      <w:r>
-        <w:rPr>
-          <w:noProof/>
-        </w:rPr>
-        <w:t>3</w:t>
-      </w:r>
-      <w:r>
-        <w:fldChar w:fldCharType="end"/>
-      </w:r>
+      <w:fldSimple w:instr=" SEQ Figure \* ARABIC ">
+        <w:r>
+          <w:rPr>
+            <w:noProof/>
+          </w:rPr>
+          <w:t>3</w:t>
+        </w:r>
+      </w:fldSimple>
       <w:r>
         <w:t>: RFM Heatmap</w:t>
       </w:r>
@@ -1618,24 +1518,14 @@
       <w:r>
         <w:t xml:space="preserve">Figure </w:t>
       </w:r>
-      <w:r>
-        <w:fldChar w:fldCharType="begin"/>
-      </w:r>
-      <w:r>
-        <w:instrText xml:space="preserve"> SEQ Figure \* ARABIC </w:instrText>
-      </w:r>
-      <w:r>
-        <w:fldChar w:fldCharType="separate"/>
-      </w:r>
-      <w:r>
-        <w:rPr>
-          <w:noProof/>
-        </w:rPr>
-        <w:t>4</w:t>
-      </w:r>
-      <w:r>
-        <w:fldChar w:fldCharType="end"/>
-      </w:r>
+      <w:fldSimple w:instr=" SEQ Figure \* ARABIC ">
+        <w:r>
+          <w:rPr>
+            <w:noProof/>
+          </w:rPr>
+          <w:t>4</w:t>
+        </w:r>
+      </w:fldSimple>
       <w:r>
         <w:t>: Top 10 Countries by Revenue</w:t>
       </w:r>
@@ -1655,35 +1545,222 @@
     <w:p/>
     <w:p/>
     <w:p/>
-    <w:p>
-      <w:pPr>
-        <w:pStyle w:val="Heading1"/>
-      </w:pPr>
-      <w:bookmarkStart w:id="4" w:name="_Toc230025376"/>
+    <w:p/>
+    <w:p>
       <w:r>
         <w:lastRenderedPageBreak/>
-        <w:t>Results: K-Means</w:t>
-      </w:r>
-      <w:bookmarkEnd w:id="4"/>
-    </w:p>
-    <w:p>
-      <w:r>
-        <w:t>Using K-means we can see in Figure 5 that three metrics are being used to select and identity the optimal number of clusters. The elbow method applied shows a curve that begins to flatten around k =4 indicating results diminishing. The highest silhouette score was at k=2 but then slowly decreases as k increases. Although k=2 has the best silhouette score, it does not provide enough to allow for a meaningful business segmentation. K=4 was selected as it represents a clear elbow in the curve and produces four interpretable customer segments that align with the RFM.</w:t>
+        <w:t xml:space="preserve">Figure 5 displays the relationship between Frequency and Monetary values across every customer that has ordered from the store. The main hypothesis was for to distinguish which customer has the higher spend. This scatterplot displays a positive trend where customers with a higher frequency tend to spend more money which is then confirmed by a positive correlation of 0.79. There is a concentration of points near the lower end of the axes which reflects the customers who order rarely and don’t spend much. The capping of GBP and the orders was applied to outliers present. The relationship between Frequency and Monetary values backs up the theory of if the customer makes orders the more money they will spend with the business. </w:t>
       </w:r>
     </w:p>
     <w:p>
       <w:pPr>
         <w:keepNext/>
       </w:pPr>
-      <w:r>
-        <w:t xml:space="preserve"> </w:t>
-      </w:r>
       <w:r>
         <w:rPr>
           <w:noProof/>
         </w:rPr>
         <w:drawing>
-          <wp:inline distT="0" distB="0" distL="0" distR="0" wp14:anchorId="6CF61264" wp14:editId="7BCBFA1D">
+          <wp:inline distT="0" distB="0" distL="0" distR="0" wp14:anchorId="5EA146AA" wp14:editId="6C20C62A">
+            <wp:extent cx="4800600" cy="3000375"/>
+            <wp:effectExtent l="0" t="0" r="0" b="9525"/>
+            <wp:docPr id="472427882" name="Picture 1"/>
+            <wp:cNvGraphicFramePr>
+              <a:graphicFrameLocks xmlns:a="http://schemas.openxmlformats.org/drawingml/2006/main" noChangeAspect="1"/>
+            </wp:cNvGraphicFramePr>
+            <a:graphic xmlns:a="http://schemas.openxmlformats.org/drawingml/2006/main">
+              <a:graphicData uri="http://schemas.openxmlformats.org/drawingml/2006/picture">
+                <pic:pic xmlns:pic="http://schemas.openxmlformats.org/drawingml/2006/picture">
+                  <pic:nvPicPr>
+                    <pic:cNvPr id="0" name="Picture 1"/>
+                    <pic:cNvPicPr>
+                      <a:picLocks noChangeAspect="1" noChangeArrowheads="1"/>
+                    </pic:cNvPicPr>
+                  </pic:nvPicPr>
+                  <pic:blipFill>
+                    <a:blip r:embed="rId11">
+                      <a:extLst>
+                        <a:ext uri="{28A0092B-C50C-407E-A947-70E740481C1C}">
+                          <a14:useLocalDpi xmlns:a14="http://schemas.microsoft.com/office/drawing/2010/main" val="0"/>
+                        </a:ext>
+                      </a:extLst>
+                    </a:blip>
+                    <a:srcRect/>
+                    <a:stretch>
+                      <a:fillRect/>
+                    </a:stretch>
+                  </pic:blipFill>
+                  <pic:spPr bwMode="auto">
+                    <a:xfrm>
+                      <a:off x="0" y="0"/>
+                      <a:ext cx="4800600" cy="3000375"/>
+                    </a:xfrm>
+                    <a:prstGeom prst="rect">
+                      <a:avLst/>
+                    </a:prstGeom>
+                    <a:noFill/>
+                    <a:ln>
+                      <a:noFill/>
+                    </a:ln>
+                  </pic:spPr>
+                </pic:pic>
+              </a:graphicData>
+            </a:graphic>
+          </wp:inline>
+        </w:drawing>
+      </w:r>
+    </w:p>
+    <w:p>
+      <w:pPr>
+        <w:pStyle w:val="Caption"/>
+      </w:pPr>
+      <w:r>
+        <w:t xml:space="preserve">Figure </w:t>
+      </w:r>
+      <w:fldSimple w:instr=" SEQ Figure \* ARABIC ">
+        <w:r>
+          <w:rPr>
+            <w:noProof/>
+          </w:rPr>
+          <w:t>5</w:t>
+        </w:r>
+      </w:fldSimple>
+      <w:r>
+        <w:t>: Frequency vs Monetary</w:t>
+      </w:r>
+    </w:p>
+    <w:p/>
+    <w:p/>
+    <w:p/>
+    <w:p/>
+    <w:p/>
+    <w:p/>
+    <w:p/>
+    <w:p/>
+    <w:p/>
+    <w:p/>
+    <w:p/>
+    <w:p/>
+    <w:p/>
+    <w:p>
+      <w:r>
+        <w:lastRenderedPageBreak/>
+        <w:t xml:space="preserve">Figure 6 shows the relationship between Recency and Monetary value amongst all customers. The hypothesis for the pair is that the customers who purchased more recently will have a higher spend. The scatterplot shows a negative trend where the customers with a lower recency tend to have a higher total spend which we can see by the concentrated left side of the graph. As recent increases past the 100 days mark the monetary values start to fall off and become sparse. This is backed up by a negative correlation of -0.27 and suggests that more recent customer are the highest value customers for the business </w:t>
+      </w:r>
+    </w:p>
+    <w:p>
+      <w:pPr>
+        <w:keepNext/>
+      </w:pPr>
+      <w:r>
+        <w:rPr>
+          <w:noProof/>
+        </w:rPr>
+        <w:drawing>
+          <wp:inline distT="0" distB="0" distL="0" distR="0" wp14:anchorId="5A55DAEA" wp14:editId="2ABC1A27">
+            <wp:extent cx="4689239" cy="2933700"/>
+            <wp:effectExtent l="0" t="0" r="0" b="0"/>
+            <wp:docPr id="1093514075" name="Picture 3"/>
+            <wp:cNvGraphicFramePr>
+              <a:graphicFrameLocks xmlns:a="http://schemas.openxmlformats.org/drawingml/2006/main" noChangeAspect="1"/>
+            </wp:cNvGraphicFramePr>
+            <a:graphic xmlns:a="http://schemas.openxmlformats.org/drawingml/2006/main">
+              <a:graphicData uri="http://schemas.openxmlformats.org/drawingml/2006/picture">
+                <pic:pic xmlns:pic="http://schemas.openxmlformats.org/drawingml/2006/picture">
+                  <pic:nvPicPr>
+                    <pic:cNvPr id="0" name="Picture 3"/>
+                    <pic:cNvPicPr>
+                      <a:picLocks noChangeAspect="1" noChangeArrowheads="1"/>
+                    </pic:cNvPicPr>
+                  </pic:nvPicPr>
+                  <pic:blipFill>
+                    <a:blip r:embed="rId12">
+                      <a:extLst>
+                        <a:ext uri="{28A0092B-C50C-407E-A947-70E740481C1C}">
+                          <a14:useLocalDpi xmlns:a14="http://schemas.microsoft.com/office/drawing/2010/main" val="0"/>
+                        </a:ext>
+                      </a:extLst>
+                    </a:blip>
+                    <a:srcRect/>
+                    <a:stretch>
+                      <a:fillRect/>
+                    </a:stretch>
+                  </pic:blipFill>
+                  <pic:spPr bwMode="auto">
+                    <a:xfrm>
+                      <a:off x="0" y="0"/>
+                      <a:ext cx="4691354" cy="2935023"/>
+                    </a:xfrm>
+                    <a:prstGeom prst="rect">
+                      <a:avLst/>
+                    </a:prstGeom>
+                    <a:noFill/>
+                    <a:ln>
+                      <a:noFill/>
+                    </a:ln>
+                  </pic:spPr>
+                </pic:pic>
+              </a:graphicData>
+            </a:graphic>
+          </wp:inline>
+        </w:drawing>
+      </w:r>
+    </w:p>
+    <w:p>
+      <w:pPr>
+        <w:pStyle w:val="Caption"/>
+      </w:pPr>
+      <w:r>
+        <w:t xml:space="preserve">Figure </w:t>
+      </w:r>
+      <w:fldSimple w:instr=" SEQ Figure \* ARABIC ">
+        <w:r>
+          <w:rPr>
+            <w:noProof/>
+          </w:rPr>
+          <w:t>6</w:t>
+        </w:r>
+      </w:fldSimple>
+      <w:r>
+        <w:t>: Recency vs Monetary</w:t>
+      </w:r>
+    </w:p>
+    <w:p/>
+    <w:p/>
+    <w:p>
+      <w:pPr>
+        <w:pStyle w:val="Heading1"/>
+      </w:pPr>
+      <w:bookmarkStart w:id="4" w:name="_Toc230025376"/>
+      <w:r>
+        <w:t>Results: K-Means</w:t>
+      </w:r>
+      <w:bookmarkEnd w:id="4"/>
+    </w:p>
+    <w:p>
+      <w:r>
+        <w:t xml:space="preserve">Using K-means we can see in Figure </w:t>
+      </w:r>
+      <w:r>
+        <w:t>7</w:t>
+      </w:r>
+      <w:r>
+        <w:t xml:space="preserve"> that three metrics are being used to select and identity the optimal number of clusters. The elbow method applied shows a curve that begins to flatten around k =4 indicating results diminishing. The highest silhouette score was at k=2 but then slowly decreases as k increases. Although k=2 has the best silhouette score, it does not provide enough to allow for a meaningful business segmentation. K=4 was selected as it represents a clear elbow in the curve and produces four interpretable customer segments that align with the RFM.</w:t>
+      </w:r>
+    </w:p>
+    <w:p>
+      <w:pPr>
+        <w:keepNext/>
+      </w:pPr>
+      <w:r>
+        <w:t xml:space="preserve"> </w:t>
+      </w:r>
+      <w:r>
+        <w:rPr>
+          <w:noProof/>
+        </w:rPr>
+        <w:drawing>
+          <wp:inline distT="0" distB="0" distL="0" distR="0" wp14:anchorId="6CF61264" wp14:editId="7E404B1D">
             <wp:extent cx="5128260" cy="1369060"/>
             <wp:effectExtent l="0" t="0" r="0" b="2540"/>
             <wp:docPr id="259740483" name="Picture 6"/>
@@ -1700,7 +1777,7 @@
                     </pic:cNvPicPr>
                   </pic:nvPicPr>
                   <pic:blipFill>
-                    <a:blip r:embed="rId11" cstate="print">
+                    <a:blip r:embed="rId13" cstate="print">
                       <a:extLst>
                         <a:ext uri="{28A0092B-C50C-407E-A947-70E740481C1C}">
                           <a14:useLocalDpi xmlns:a14="http://schemas.microsoft.com/office/drawing/2010/main" val="0"/>
@@ -1739,24 +1816,14 @@
       <w:r>
         <w:t xml:space="preserve">Figure </w:t>
       </w:r>
-      <w:r>
-        <w:fldChar w:fldCharType="begin"/>
-      </w:r>
-      <w:r>
-        <w:instrText xml:space="preserve"> SEQ Figure \* ARABIC </w:instrText>
-      </w:r>
-      <w:r>
-        <w:fldChar w:fldCharType="separate"/>
-      </w:r>
-      <w:r>
-        <w:rPr>
-          <w:noProof/>
-        </w:rPr>
-        <w:t>5</w:t>
-      </w:r>
-      <w:r>
-        <w:fldChar w:fldCharType="end"/>
-      </w:r>
+      <w:fldSimple w:instr=" SEQ Figure \* ARABIC ">
+        <w:r>
+          <w:rPr>
+            <w:noProof/>
+          </w:rPr>
+          <w:t>7</w:t>
+        </w:r>
+      </w:fldSimple>
       <w:r>
         <w:t>: Discovering the best K</w:t>
       </w:r>
@@ -1767,7 +1834,7 @@
         <w:t xml:space="preserve">With Figure </w:t>
       </w:r>
       <w:r>
-        <w:t>6</w:t>
+        <w:t>8</w:t>
       </w:r>
       <w:r>
         <w:t xml:space="preserve"> we can properly visualize the four K-means customer segments. The segments were divided into Champions (Customers who buy often and spend the most), Loyal Customers (Active customers and still buy regularly), At-Risk (Haven’t bought in a while and don’t spend a lot) and Lost/Inactive (Customers who haven’t bought in over 250 days and are less likely to splurge).  </w:t>
@@ -1796,7 +1863,7 @@
           <w:noProof/>
         </w:rPr>
         <w:drawing>
-          <wp:inline distT="0" distB="0" distL="0" distR="0" wp14:anchorId="179960B2" wp14:editId="4B668B34">
+          <wp:inline distT="0" distB="0" distL="0" distR="0" wp14:anchorId="179960B2" wp14:editId="0C85A60F">
             <wp:extent cx="5725160" cy="2043430"/>
             <wp:effectExtent l="0" t="0" r="8890" b="0"/>
             <wp:docPr id="98495623" name="Picture 7"/>
@@ -1813,7 +1880,7 @@
                     </pic:cNvPicPr>
                   </pic:nvPicPr>
                   <pic:blipFill>
-                    <a:blip r:embed="rId12" cstate="print">
+                    <a:blip r:embed="rId14" cstate="print">
                       <a:extLst>
                         <a:ext uri="{28A0092B-C50C-407E-A947-70E740481C1C}">
                           <a14:useLocalDpi xmlns:a14="http://schemas.microsoft.com/office/drawing/2010/main" val="0"/>
@@ -1852,35 +1919,27 @@
       <w:r>
         <w:t xml:space="preserve">Figure </w:t>
       </w:r>
-      <w:r>
-        <w:fldChar w:fldCharType="begin"/>
-      </w:r>
-      <w:r>
-        <w:instrText xml:space="preserve"> SEQ Figure \* ARABIC </w:instrText>
-      </w:r>
-      <w:r>
-        <w:fldChar w:fldCharType="separate"/>
+      <w:fldSimple w:instr=" SEQ Figure \* ARABIC ">
+        <w:r>
+          <w:rPr>
+            <w:noProof/>
+          </w:rPr>
+          <w:t>8</w:t>
+        </w:r>
+      </w:fldSimple>
+      <w:r>
+        <w:t>: K-means Customer Segments using k=4</w:t>
+      </w:r>
+    </w:p>
+    <w:p/>
+    <w:p>
+      <w:r>
+        <w:t>Using the model with k-means it provided the four segments. Champions made up 2.5% of the total spend with 15,280GBP and ordered 24 times on average. Loyal customers represented just under 13% of total customers with a moderate frequency of spending. At-risk customers were higher with 60.8% of total customers with a lower average frequency and a lower average monetary. Lost and inactive customers represented just under 24% of the total customers</w:t>
       </w:r>
       <w:r>
         <w:rPr>
           <w:noProof/>
         </w:rPr>
-        <w:t>6</w:t>
-      </w:r>
-      <w:r>
-        <w:fldChar w:fldCharType="end"/>
-      </w:r>
-      <w:r>
-        <w:t>: K-means Customer Segments using k=4</w:t>
-      </w:r>
-    </w:p>
-    <w:p/>
-    <w:p>
-      <w:r>
-        <w:lastRenderedPageBreak/>
-        <w:t>Using the model with k-means it provided the four segments. Champions made up 2.5% of the total spend with 15,280GBP and ordered 24 times on average. Loyal customers represented just under 13% of total customers with a moderate frequency of spending. At-risk customers were higher with 60.8% of total customers with a lower average frequency and a lower average monetary. Lost and inactive customers represented just under 24% of the total customers</w:t>
-      </w:r>
-      <w:r>
         <w:drawing>
           <wp:inline distT="0" distB="0" distL="0" distR="0" wp14:anchorId="190C7164" wp14:editId="234B2D23">
             <wp:extent cx="5731510" cy="1200785"/>
@@ -1897,7 +1956,7 @@
                     <pic:cNvPicPr/>
                   </pic:nvPicPr>
                   <pic:blipFill>
-                    <a:blip r:embed="rId13"/>
+                    <a:blip r:embed="rId15"/>
                     <a:stretch>
                       <a:fillRect/>
                     </a:stretch>
@@ -1926,13 +1985,20 @@
       </w:pPr>
       <w:bookmarkStart w:id="5" w:name="_Toc230025377"/>
       <w:r>
+        <w:lastRenderedPageBreak/>
         <w:t>Results: DBscan</w:t>
       </w:r>
       <w:bookmarkEnd w:id="5"/>
     </w:p>
     <w:p>
       <w:r>
-        <w:t>When selecting the optimal epsilon value for DBscan a k-distance graph was used (Figure 7). For each point in the retail dataset, the distance to the nearest 5</w:t>
+        <w:t xml:space="preserve">When selecting the optimal epsilon value for DBscan a k-distance graph was used (Figure </w:t>
+      </w:r>
+      <w:r>
+        <w:t>9</w:t>
+      </w:r>
+      <w:r>
+        <w:t>). For each point in the retail dataset, the distance to the nearest 5</w:t>
       </w:r>
       <w:r>
         <w:rPr>
@@ -1941,15 +2007,7 @@
         <w:t>th</w:t>
       </w:r>
       <w:r>
-        <w:t xml:space="preserve"> neighbour was calculated and plotted in descending order. The elbow of the curve occurs at approx. 0.5. This value was selected as the epsilon as points beyond the threshold would be in regions that could create noise and display totally different results. A parameter </w:t>
-      </w:r>
-      <w:proofErr w:type="gramStart"/>
-      <w:r>
-        <w:t>sweep</w:t>
-      </w:r>
-      <w:proofErr w:type="gramEnd"/>
-      <w:r>
-        <w:t xml:space="preserve"> across the multiple epsilon values also confirmed that 0.5 produced the more meaningful number of clusters with acceptable noise.</w:t>
+        <w:t xml:space="preserve"> neighbour was calculated and plotted in descending order. The elbow of the curve occurs at approx. 0.5. This value was selected as the epsilon as points beyond the threshold would be in regions that could create noise and display totally different results. A parameter sweep across the multiple epsilon values also confirmed that 0.5 produced the more meaningful number of clusters with acceptable noise.</w:t>
       </w:r>
     </w:p>
     <w:p>
@@ -1978,7 +2036,7 @@
                     </pic:cNvPicPr>
                   </pic:nvPicPr>
                   <pic:blipFill>
-                    <a:blip r:embed="rId14">
+                    <a:blip r:embed="rId16">
                       <a:extLst>
                         <a:ext uri="{28A0092B-C50C-407E-A947-70E740481C1C}">
                           <a14:useLocalDpi xmlns:a14="http://schemas.microsoft.com/office/drawing/2010/main" val="0"/>
@@ -2017,74 +2075,67 @@
       <w:r>
         <w:t xml:space="preserve">Figure </w:t>
       </w:r>
-      <w:r>
-        <w:fldChar w:fldCharType="begin"/>
-      </w:r>
-      <w:r>
-        <w:instrText xml:space="preserve"> SEQ Figure \* ARABIC </w:instrText>
-      </w:r>
-      <w:r>
-        <w:fldChar w:fldCharType="separate"/>
-      </w:r>
+      <w:fldSimple w:instr=" SEQ Figure \* ARABIC ">
+        <w:r>
+          <w:rPr>
+            <w:noProof/>
+          </w:rPr>
+          <w:t>9</w:t>
+        </w:r>
+      </w:fldSimple>
+      <w:r>
+        <w:t>: k-Distance Graph to find optimal eps</w:t>
+      </w:r>
+    </w:p>
+    <w:p>
+      <w:r>
+        <w:t xml:space="preserve">Figure </w:t>
+      </w:r>
+      <w:r>
+        <w:t>10</w:t>
+      </w:r>
+      <w:r>
+        <w:t xml:space="preserve"> shows the DBscan customer segments. Unlike K-Means, DBscan identified 7 total clusters with noise points shown in grey. The more </w:t>
+      </w:r>
+      <w:r>
+        <w:t>dominant</w:t>
+      </w:r>
+      <w:r>
+        <w:t xml:space="preserve"> </w:t>
+      </w:r>
+      <w:r>
+        <w:t>cluster</w:t>
+      </w:r>
+      <w:r>
+        <w:t xml:space="preserve"> contained </w:t>
+      </w:r>
+      <w:r>
+        <w:t>most</w:t>
+      </w:r>
+      <w:r>
+        <w:t xml:space="preserve"> customers at 4198 out of 4,338 while the remaining other clusters are smaller. This reveals a limitation with DBscan when using this specific dataset. The density of the RFM space causes most customers to be grouped into one large undifferentiated cluster which is making it less </w:t>
+      </w:r>
+      <w:r>
+        <w:t>useful for</w:t>
+      </w:r>
+      <w:r>
+        <w:t xml:space="preserve"> the business</w:t>
+      </w:r>
+      <w:r>
+        <w:t>.</w:t>
+      </w:r>
+    </w:p>
+    <w:p/>
+    <w:p>
+      <w:pPr>
+        <w:keepNext/>
+      </w:pPr>
       <w:r>
         <w:rPr>
           <w:noProof/>
         </w:rPr>
-        <w:t>7</w:t>
-      </w:r>
-      <w:r>
-        <w:fldChar w:fldCharType="end"/>
-      </w:r>
-      <w:r>
-        <w:t>: k-Distance Graph to find optimal eps</w:t>
-      </w:r>
-    </w:p>
-    <w:p>
-      <w:r>
-        <w:t xml:space="preserve">Figure 8 shows the DBscan customer segments. Unlike K-Means, DBscan identified 7 total clusters with noise points shown in grey. The more </w:t>
-      </w:r>
-      <w:r>
-        <w:t>dominant</w:t>
-      </w:r>
-      <w:r>
-        <w:t xml:space="preserve"> </w:t>
-      </w:r>
-      <w:r>
-        <w:t>cluster</w:t>
-      </w:r>
-      <w:r>
-        <w:t xml:space="preserve"> contained </w:t>
-      </w:r>
-      <w:proofErr w:type="gramStart"/>
-      <w:r>
-        <w:t>the majority of</w:t>
-      </w:r>
-      <w:proofErr w:type="gramEnd"/>
-      <w:r>
-        <w:t xml:space="preserve"> customers at 4198 out of 4,338 while the remaining other clusters are smaller. This reveals a limitation with DBscan when using this specific dataset. The density of the RFM space causes most customers to be grouped into one large undifferentiated cluster which is making it less </w:t>
-      </w:r>
-      <w:r>
-        <w:t>useful for</w:t>
-      </w:r>
-      <w:r>
-        <w:t xml:space="preserve"> the business</w:t>
-      </w:r>
-      <w:r>
-        <w:t>.</w:t>
-      </w:r>
-    </w:p>
-    <w:p/>
-    <w:p>
-      <w:pPr>
-        <w:keepNext/>
-      </w:pPr>
-      <w:r>
-        <w:rPr>
-          <w:noProof/>
-        </w:rPr>
-        <w:lastRenderedPageBreak/>
         <w:drawing>
-          <wp:inline distT="0" distB="0" distL="0" distR="0" wp14:anchorId="64B79629" wp14:editId="72088340">
+          <wp:inline distT="0" distB="0" distL="0" distR="0" wp14:anchorId="64B79629" wp14:editId="59618058">
             <wp:extent cx="5725160" cy="2043430"/>
             <wp:effectExtent l="0" t="0" r="8890" b="0"/>
             <wp:docPr id="2136660302" name="Picture 10"/>
@@ -2101,7 +2152,7 @@
                     </pic:cNvPicPr>
                   </pic:nvPicPr>
                   <pic:blipFill>
-                    <a:blip r:embed="rId15" cstate="print">
+                    <a:blip r:embed="rId17" cstate="print">
                       <a:extLst>
                         <a:ext uri="{28A0092B-C50C-407E-A947-70E740481C1C}">
                           <a14:useLocalDpi xmlns:a14="http://schemas.microsoft.com/office/drawing/2010/main" val="0"/>
@@ -2140,24 +2191,14 @@
       <w:r>
         <w:t xml:space="preserve">Figure </w:t>
       </w:r>
-      <w:r>
-        <w:fldChar w:fldCharType="begin"/>
-      </w:r>
-      <w:r>
-        <w:instrText xml:space="preserve"> SEQ Figure \* ARABIC </w:instrText>
-      </w:r>
-      <w:r>
-        <w:fldChar w:fldCharType="separate"/>
-      </w:r>
-      <w:r>
-        <w:rPr>
-          <w:noProof/>
-        </w:rPr>
-        <w:t>8</w:t>
-      </w:r>
-      <w:r>
-        <w:fldChar w:fldCharType="end"/>
-      </w:r>
+      <w:fldSimple w:instr=" SEQ Figure \* ARABIC ">
+        <w:r>
+          <w:rPr>
+            <w:noProof/>
+          </w:rPr>
+          <w:t>10</w:t>
+        </w:r>
+      </w:fldSimple>
       <w:r>
         <w:t>: DBSCAN analysis with Segments\</w:t>
       </w:r>
@@ -2168,6 +2209,7 @@
       </w:pPr>
       <w:bookmarkStart w:id="6" w:name="_Toc230025378"/>
       <w:r>
+        <w:lastRenderedPageBreak/>
         <w:t>Discussion</w:t>
       </w:r>
       <w:bookmarkEnd w:id="6"/>
@@ -2201,7 +2243,7 @@
                     </pic:cNvPicPr>
                   </pic:nvPicPr>
                   <pic:blipFill>
-                    <a:blip r:embed="rId16">
+                    <a:blip r:embed="rId18">
                       <a:extLst>
                         <a:ext uri="{28A0092B-C50C-407E-A947-70E740481C1C}">
                           <a14:useLocalDpi xmlns:a14="http://schemas.microsoft.com/office/drawing/2010/main" val="0"/>
@@ -2240,24 +2282,14 @@
       <w:r>
         <w:t xml:space="preserve">Figure </w:t>
       </w:r>
-      <w:r>
-        <w:fldChar w:fldCharType="begin"/>
-      </w:r>
-      <w:r>
-        <w:instrText xml:space="preserve"> SEQ Figure \* ARABIC </w:instrText>
-      </w:r>
-      <w:r>
-        <w:fldChar w:fldCharType="separate"/>
-      </w:r>
-      <w:r>
-        <w:rPr>
-          <w:noProof/>
-        </w:rPr>
-        <w:t>9</w:t>
-      </w:r>
-      <w:r>
-        <w:fldChar w:fldCharType="end"/>
-      </w:r>
+      <w:fldSimple w:instr=" SEQ Figure \* ARABIC ">
+        <w:r>
+          <w:rPr>
+            <w:noProof/>
+          </w:rPr>
+          <w:t>11</w:t>
+        </w:r>
+      </w:fldSimple>
       <w:r>
         <w:t>: Model Comparison</w:t>
       </w:r>
@@ -2279,15 +2311,7 @@
         <w:t xml:space="preserve"> models are identifying similar structure in the data. K-means comes out on top due to it producing a more balanced and actionable segments. </w:t>
       </w:r>
       <w:r>
-        <w:t>DBSCAN had a better silhouette and Davies-Bouldin score than K-</w:t>
-      </w:r>
-      <w:proofErr w:type="gramStart"/>
-      <w:r>
-        <w:t>means</w:t>
-      </w:r>
-      <w:proofErr w:type="gramEnd"/>
-      <w:r>
-        <w:t xml:space="preserve"> but it placed the customers into a singular cluster which is difficult to use due to the customers being seen the same way. K-means however produced four correctly balanced segments that have a clear meaning behind them. For the more Champions that can have special offers and a VIP experience, Loyal customers can have regular sent emails so they can stay notified about the store, </w:t>
+        <w:t xml:space="preserve">DBSCAN had a better silhouette and Davies-Bouldin score than K-means but it placed the customers into a singular cluster which is difficult to use due to the customers being seen the same way. K-means however produced four correctly balanced segments that have a clear meaning behind them. For the more Champions that can have special offers and a VIP experience, Loyal customers can have regular sent emails so they can stay notified about the store, </w:t>
       </w:r>
       <w:r>
         <w:t>Customers at-</w:t>
@@ -2323,7 +2347,7 @@
                     </pic:cNvPicPr>
                   </pic:nvPicPr>
                   <pic:blipFill>
-                    <a:blip r:embed="rId17">
+                    <a:blip r:embed="rId19">
                       <a:extLst>
                         <a:ext uri="{28A0092B-C50C-407E-A947-70E740481C1C}">
                           <a14:useLocalDpi xmlns:a14="http://schemas.microsoft.com/office/drawing/2010/main" val="0"/>
@@ -2362,24 +2386,14 @@
       <w:r>
         <w:t xml:space="preserve">Figure </w:t>
       </w:r>
-      <w:r>
-        <w:fldChar w:fldCharType="begin"/>
-      </w:r>
-      <w:r>
-        <w:instrText xml:space="preserve"> SEQ Figure \* ARABIC </w:instrText>
-      </w:r>
-      <w:r>
-        <w:fldChar w:fldCharType="separate"/>
-      </w:r>
-      <w:r>
-        <w:rPr>
-          <w:noProof/>
-        </w:rPr>
-        <w:t>10</w:t>
-      </w:r>
-      <w:r>
-        <w:fldChar w:fldCharType="end"/>
-      </w:r>
+      <w:fldSimple w:instr=" SEQ Figure \* ARABIC ">
+        <w:r>
+          <w:rPr>
+            <w:noProof/>
+          </w:rPr>
+          <w:t>12</w:t>
+        </w:r>
+      </w:fldSimple>
       <w:r>
         <w:t>: Confusion Matrix</w:t>
       </w:r>
@@ -2416,24 +2430,12 @@
       <w:r>
         <w:t xml:space="preserve">UCI Machine Learning Repository (2015) Online Retail Dataset </w:t>
       </w:r>
-      <w:hyperlink r:id="rId18" w:history="1">
+      <w:hyperlink r:id="rId20" w:history="1">
         <w:r>
           <w:rPr>
             <w:rStyle w:val="Hyperlink"/>
           </w:rPr>
-          <w:t>https://archive.ics.uci.edu/dataset/352/online</w:t>
-        </w:r>
-        <w:r>
-          <w:rPr>
-            <w:rStyle w:val="Hyperlink"/>
-          </w:rPr>
-          <w:t>+</w:t>
-        </w:r>
-        <w:r>
-          <w:rPr>
-            <w:rStyle w:val="Hyperlink"/>
-          </w:rPr>
-          <w:t>retail</w:t>
+          <w:t>https://archive.ics.uci.edu/dataset/352/online+retail</w:t>
         </w:r>
       </w:hyperlink>
     </w:p>
@@ -3100,6 +3102,7 @@
   <w:style w:type="character" w:default="1" w:styleId="DefaultParagraphFont">
     <w:name w:val="Default Paragraph Font"/>
     <w:uiPriority w:val="1"/>
+    <w:semiHidden/>
     <w:unhideWhenUsed/>
   </w:style>
   <w:style w:type="table" w:default="1" w:styleId="TableNormal">

</xml_diff>